<commit_message>
2AS unit 1: add variation rules for sqrt(u) and 1/u with example and exercise, update template
Co-Authored-By: Claude Opus 5.5 <noreply@anthropic.com>
Claude-Session: https://claude.ai/code/session_015WVgZKTbSWpZTjn6aZsqC9
</commit_message>
<xml_diff>
--- a/documents/2as/molakhas_2as_wahda1.docx
+++ b/documents/2as/molakhas_2as_wahda1.docx
@@ -256,6 +256,72 @@
               <m:r>
                 <m:t>f</m:t>
               </m:r>
+            </m:oMath>
+            <w:r>
+              <w:rPr>
+                <w:rtl/>
+              </w:rPr>
+              <w:t xml:space="preserve"> </w:t>
+            </w:r>
+            <w:r>
+              <w:rPr>
+                <w:rtl/>
+              </w:rPr>
+              <w:t xml:space="preserve">،</w:t>
+            </w:r>
+            <w:r>
+              <w:rPr>
+                <w:rtl/>
+              </w:rPr>
+              <w:t xml:space="preserve"> </w:t>
+            </w:r>
+            <m:oMath>
+              <m:rad>
+                <m:radPr>
+                  <m:degHide m:val="on"/>
+                </m:radPr>
+                <m:deg/>
+                <m:e>
+                  <m:r>
+                    <m:t>u</m:t>
+                  </m:r>
+                </m:e>
+              </m:rad>
+            </m:oMath>
+            <w:r>
+              <w:rPr>
+                <w:rtl/>
+              </w:rPr>
+              <w:t xml:space="preserve"> </w:t>
+            </w:r>
+            <w:r>
+              <w:rPr>
+                <w:rtl/>
+              </w:rPr>
+              <w:t xml:space="preserve">،</w:t>
+            </w:r>
+            <w:r>
+              <w:rPr>
+                <w:rtl/>
+              </w:rPr>
+              <w:t xml:space="preserve"> </w:t>
+            </w:r>
+            <m:oMath>
+              <m:f>
+                <m:fPr>
+                  <m:type m:val="bar"/>
+                </m:fPr>
+                <m:num>
+                  <m:r>
+                    <m:t>1</m:t>
+                  </m:r>
+                </m:num>
+                <m:den>
+                  <m:r>
+                    <m:t>u</m:t>
+                  </m:r>
+                </m:den>
+              </m:f>
             </m:oMath>
             <w:r>
               <w:rPr>
@@ -4660,7 +4726,7 @@
                           <a:graphicData uri="http://schemas.openxmlformats.org/drawingml/2006/picture">
                             <pic:pic>
                               <pic:nvPicPr>
-                                <pic:cNvPr id="0" name="b85a8b92e5124742.png"/>
+                                <pic:cNvPr id="0" name="766933870e334481.png"/>
                                 <pic:cNvPicPr/>
                               </pic:nvPicPr>
                               <pic:blipFill>
@@ -4871,7 +4937,7 @@
                           <a:graphicData uri="http://schemas.openxmlformats.org/drawingml/2006/picture">
                             <pic:pic>
                               <pic:nvPicPr>
-                                <pic:cNvPr id="0" name="e7b55b152c9fe7e7.png"/>
+                                <pic:cNvPr id="0" name="f7ade8dd470ecc28.png"/>
                                 <pic:cNvPicPr/>
                               </pic:nvPicPr>
                               <pic:blipFill>
@@ -5085,7 +5151,7 @@
                           <a:graphicData uri="http://schemas.openxmlformats.org/drawingml/2006/picture">
                             <pic:pic>
                               <pic:nvPicPr>
-                                <pic:cNvPr id="0" name="ad28b26dd1317083.png"/>
+                                <pic:cNvPr id="0" name="af44e146a26c2280.png"/>
                                 <pic:cNvPicPr/>
                               </pic:nvPicPr>
                               <pic:blipFill>
@@ -5242,7 +5308,7 @@
                           <a:graphicData uri="http://schemas.openxmlformats.org/drawingml/2006/picture">
                             <pic:pic>
                               <pic:nvPicPr>
-                                <pic:cNvPr id="0" name="8533f69924ea38fe.png"/>
+                                <pic:cNvPr id="0" name="bb1bd6225a67a4a0.png"/>
                                 <pic:cNvPicPr/>
                               </pic:nvPicPr>
                               <pic:blipFill>
@@ -5454,7 +5520,7 @@
                           <a:graphicData uri="http://schemas.openxmlformats.org/drawingml/2006/picture">
                             <pic:pic>
                               <pic:nvPicPr>
-                                <pic:cNvPr id="0" name="1d7899417325279c.png"/>
+                                <pic:cNvPr id="0" name="61f743472f6396ad.png"/>
                                 <pic:cNvPicPr/>
                               </pic:nvPicPr>
                               <pic:blipFill>
@@ -10000,7 +10066,7 @@
       </w:pPr>
     </w:p>
     <w:bookmarkEnd w:id="24"/>
-    <w:bookmarkStart w:id="25" w:name="اتجاه-تغير-الدوال-fk-lambda-f-gcirc-f"/>
+    <w:bookmarkStart w:id="25" w:name="Xce36f99a8c3f5bc1e01ca5aba892c2c4b085f47"/>
     <w:p>
       <w:pPr>
         <w:pStyle w:val="Heading1"/>
@@ -10090,6 +10156,72 @@
         <w:t xml:space="preserve"> </w:t>
       </w:r>
       <m:oMath>
+        <m:rad>
+          <m:radPr>
+            <m:degHide m:val="on"/>
+          </m:radPr>
+          <m:deg/>
+          <m:e>
+            <m:r>
+              <m:t>u</m:t>
+            </m:r>
+          </m:e>
+        </m:rad>
+      </m:oMath>
+      <w:r>
+        <w:rPr>
+          <w:rtl/>
+        </w:rPr>
+        <w:t xml:space="preserve"> </w:t>
+      </w:r>
+      <w:r>
+        <w:rPr>
+          <w:rtl/>
+        </w:rPr>
+        <w:t xml:space="preserve">،</w:t>
+      </w:r>
+      <w:r>
+        <w:rPr>
+          <w:rtl/>
+        </w:rPr>
+        <w:t xml:space="preserve"> </w:t>
+      </w:r>
+      <m:oMath>
+        <m:f>
+          <m:fPr>
+            <m:type m:val="bar"/>
+          </m:fPr>
+          <m:num>
+            <m:r>
+              <m:t>1</m:t>
+            </m:r>
+          </m:num>
+          <m:den>
+            <m:r>
+              <m:t>u</m:t>
+            </m:r>
+          </m:den>
+        </m:f>
+      </m:oMath>
+      <w:r>
+        <w:rPr>
+          <w:rtl/>
+        </w:rPr>
+        <w:t xml:space="preserve"> </w:t>
+      </w:r>
+      <w:r>
+        <w:rPr>
+          <w:rtl/>
+        </w:rPr>
+        <w:t xml:space="preserve">،</w:t>
+      </w:r>
+      <w:r>
+        <w:rPr>
+          <w:rtl/>
+        </w:rPr>
+        <w:t xml:space="preserve"> </w:t>
+      </w:r>
+      <m:oMath>
         <m:r>
           <m:t>g</m:t>
         </m:r>
@@ -10577,6 +10709,340 @@
                     <m:r>
                       <m:t>f</m:t>
                     </m:r>
+                  </m:oMath>
+                </w:p>
+              </w:tc>
+            </w:tr>
+            <w:tr>
+              <w:tc>
+                <w:tcPr/>
+                <w:p>
+                  <w:pPr>
+                    <w:pStyle w:val="Compact"/>
+                    <w:bidi/>
+                    <w:jc w:val="left"/>
+                  </w:pPr>
+                  <w:r>
+                    <w:rPr>
+                      <w:rtl/>
+                    </w:rPr>
+                    <w:t xml:space="preserve">إذا كانت</w:t>
+                  </w:r>
+                  <w:r>
+                    <w:rPr>
+                      <w:rtl/>
+                    </w:rPr>
+                    <w:t xml:space="preserve"> </w:t>
+                  </w:r>
+                  <m:oMath>
+                    <m:r>
+                      <m:t>f</m:t>
+                    </m:r>
+                    <m:d>
+                      <m:dPr>
+                        <m:begChr m:val="("/>
+                        <m:endChr m:val=")"/>
+                        <m:sepChr m:val=""/>
+                        <m:grow/>
+                      </m:dPr>
+                      <m:e>
+                        <m:r>
+                          <m:t>x</m:t>
+                        </m:r>
+                      </m:e>
+                    </m:d>
+                    <m:r>
+                      <m:rPr>
+                        <m:sty m:val="p"/>
+                      </m:rPr>
+                      <m:t>≥</m:t>
+                    </m:r>
+                    <m:r>
+                      <m:t>0</m:t>
+                    </m:r>
+                  </m:oMath>
+                  <w:r>
+                    <w:rPr>
+                      <w:rtl/>
+                    </w:rPr>
+                    <w:t xml:space="preserve"> </w:t>
+                  </w:r>
+                  <w:r>
+                    <w:rPr>
+                      <w:rtl/>
+                    </w:rPr>
+                    <w:t xml:space="preserve">على</w:t>
+                  </w:r>
+                  <w:r>
+                    <w:rPr>
+                      <w:rtl/>
+                    </w:rPr>
+                    <w:t xml:space="preserve"> </w:t>
+                  </w:r>
+                  <m:oMath>
+                    <m:r>
+                      <m:t>I</m:t>
+                    </m:r>
+                  </m:oMath>
+                  <w:r>
+                    <w:rPr>
+                      <w:rtl/>
+                    </w:rPr>
+                    <w:t xml:space="preserve">: للدالتين</w:t>
+                  </w:r>
+                  <w:r>
+                    <w:rPr>
+                      <w:rtl/>
+                    </w:rPr>
+                    <w:t xml:space="preserve"> </w:t>
+                  </w:r>
+                  <m:oMath>
+                    <m:r>
+                      <m:t>f</m:t>
+                    </m:r>
+                  </m:oMath>
+                  <w:r>
+                    <w:rPr>
+                      <w:rtl/>
+                    </w:rPr>
+                    <w:t xml:space="preserve"> </w:t>
+                  </w:r>
+                  <w:r>
+                    <w:rPr>
+                      <w:rtl/>
+                    </w:rPr>
+                    <w:t xml:space="preserve">و</w:t>
+                  </w:r>
+                  <w:r>
+                    <w:rPr>
+                      <w:rtl/>
+                    </w:rPr>
+                    <w:t xml:space="preserve"> </w:t>
+                  </w:r>
+                  <m:oMath>
+                    <m:rad>
+                      <m:radPr>
+                        <m:degHide m:val="on"/>
+                      </m:radPr>
+                      <m:deg/>
+                      <m:e>
+                        <m:r>
+                          <m:t>f</m:t>
+                        </m:r>
+                      </m:e>
+                    </m:rad>
+                  </m:oMath>
+                  <w:r>
+                    <w:rPr>
+                      <w:rtl/>
+                    </w:rPr>
+                    <w:t xml:space="preserve"> </w:t>
+                  </w:r>
+                  <w:r>
+                    <w:rPr>
+                      <w:rtl/>
+                    </w:rPr>
+                    <w:t xml:space="preserve">نفس اتجاه التغير على</w:t>
+                  </w:r>
+                  <w:r>
+                    <w:rPr>
+                      <w:rtl/>
+                    </w:rPr>
+                    <w:t xml:space="preserve"> </w:t>
+                  </w:r>
+                  <m:oMath>
+                    <m:r>
+                      <m:t>I</m:t>
+                    </m:r>
+                  </m:oMath>
+                  <w:r>
+                    <w:rPr>
+                      <w:rtl/>
+                    </w:rPr>
+                    <w:t xml:space="preserve">.</w:t>
+                  </w:r>
+                </w:p>
+              </w:tc>
+              <w:tc>
+                <w:tcPr/>
+                <w:p>
+                  <w:pPr>
+                    <w:pStyle w:val="Compact"/>
+                    <w:bidi/>
+                    <w:jc w:val="left"/>
+                  </w:pPr>
+                  <m:oMath>
+                    <m:rad>
+                      <m:radPr>
+                        <m:degHide m:val="on"/>
+                      </m:radPr>
+                      <m:deg/>
+                      <m:e>
+                        <m:r>
+                          <m:t>f</m:t>
+                        </m:r>
+                      </m:e>
+                    </m:rad>
+                  </m:oMath>
+                </w:p>
+              </w:tc>
+            </w:tr>
+            <w:tr>
+              <w:tc>
+                <w:tcPr/>
+                <w:p>
+                  <w:pPr>
+                    <w:pStyle w:val="Compact"/>
+                    <w:bidi/>
+                    <w:jc w:val="left"/>
+                  </w:pPr>
+                  <w:r>
+                    <w:rPr>
+                      <w:rtl/>
+                    </w:rPr>
+                    <w:t xml:space="preserve">إذا كانت</w:t>
+                  </w:r>
+                  <w:r>
+                    <w:rPr>
+                      <w:rtl/>
+                    </w:rPr>
+                    <w:t xml:space="preserve"> </w:t>
+                  </w:r>
+                  <m:oMath>
+                    <m:r>
+                      <m:t>f</m:t>
+                    </m:r>
+                  </m:oMath>
+                  <w:r>
+                    <w:rPr>
+                      <w:rtl/>
+                    </w:rPr>
+                    <w:t xml:space="preserve"> </w:t>
+                  </w:r>
+                  <w:r>
+                    <w:rPr>
+                      <w:rtl/>
+                    </w:rPr>
+                    <w:t xml:space="preserve">لا تنعدم ولها إشارة ثابتة على</w:t>
+                  </w:r>
+                  <w:r>
+                    <w:rPr>
+                      <w:rtl/>
+                    </w:rPr>
+                    <w:t xml:space="preserve"> </w:t>
+                  </w:r>
+                  <m:oMath>
+                    <m:r>
+                      <m:t>I</m:t>
+                    </m:r>
+                  </m:oMath>
+                  <w:r>
+                    <w:rPr>
+                      <w:rtl/>
+                    </w:rPr>
+                    <w:t xml:space="preserve">: اتجاها تغير</w:t>
+                  </w:r>
+                  <w:r>
+                    <w:rPr>
+                      <w:rtl/>
+                    </w:rPr>
+                    <w:t xml:space="preserve"> </w:t>
+                  </w:r>
+                  <m:oMath>
+                    <m:r>
+                      <m:t>f</m:t>
+                    </m:r>
+                  </m:oMath>
+                  <w:r>
+                    <w:rPr>
+                      <w:rtl/>
+                    </w:rPr>
+                    <w:t xml:space="preserve"> </w:t>
+                  </w:r>
+                  <w:r>
+                    <w:rPr>
+                      <w:rtl/>
+                    </w:rPr>
+                    <w:t xml:space="preserve">و</w:t>
+                  </w:r>
+                  <w:r>
+                    <w:rPr>
+                      <w:rtl/>
+                    </w:rPr>
+                    <w:t xml:space="preserve"> </w:t>
+                  </w:r>
+                  <m:oMath>
+                    <m:f>
+                      <m:fPr>
+                        <m:type m:val="bar"/>
+                      </m:fPr>
+                      <m:num>
+                        <m:r>
+                          <m:t>1</m:t>
+                        </m:r>
+                      </m:num>
+                      <m:den>
+                        <m:r>
+                          <m:t>f</m:t>
+                        </m:r>
+                      </m:den>
+                    </m:f>
+                  </m:oMath>
+                  <w:r>
+                    <w:rPr>
+                      <w:rtl/>
+                    </w:rPr>
+                    <w:t xml:space="preserve"> </w:t>
+                  </w:r>
+                  <w:r>
+                    <w:rPr>
+                      <w:rtl/>
+                    </w:rPr>
+                    <w:t xml:space="preserve">متعاكسان على</w:t>
+                  </w:r>
+                  <w:r>
+                    <w:rPr>
+                      <w:rtl/>
+                    </w:rPr>
+                    <w:t xml:space="preserve"> </w:t>
+                  </w:r>
+                  <m:oMath>
+                    <m:r>
+                      <m:t>I</m:t>
+                    </m:r>
+                  </m:oMath>
+                  <w:r>
+                    <w:rPr>
+                      <w:rtl/>
+                    </w:rPr>
+                    <w:t xml:space="preserve">.</w:t>
+                  </w:r>
+                </w:p>
+              </w:tc>
+              <w:tc>
+                <w:tcPr/>
+                <w:p>
+                  <w:pPr>
+                    <w:pStyle w:val="Compact"/>
+                    <w:bidi/>
+                    <w:jc w:val="left"/>
+                  </w:pPr>
+                  <m:oMath>
+                    <m:f>
+                      <m:fPr>
+                        <m:type m:val="bar"/>
+                      </m:fPr>
+                      <m:num>
+                        <m:r>
+                          <m:t>1</m:t>
+                        </m:r>
+                      </m:num>
+                      <m:den>
+                        <m:r>
+                          <m:t>f</m:t>
+                        </m:r>
+                      </m:den>
+                    </m:f>
                   </m:oMath>
                 </w:p>
               </w:tc>
@@ -11687,6 +12153,1199 @@
                 <w:rtl/>
               </w:rPr>
               <w:t xml:space="preserve">متناقصة تماماً.</w:t>
+            </w:r>
+          </w:p>
+          <w:p>
+            <w:pPr>
+              <w:numPr>
+                <w:ilvl w:val="0"/>
+                <w:numId w:val="1006"/>
+              </w:numPr>
+              <w:bidi/>
+            </w:pPr>
+            <m:oMath>
+              <m:r>
+                <m:t>h</m:t>
+              </m:r>
+              <m:d>
+                <m:dPr>
+                  <m:begChr m:val="("/>
+                  <m:endChr m:val=")"/>
+                  <m:sepChr m:val=""/>
+                  <m:grow/>
+                </m:dPr>
+                <m:e>
+                  <m:r>
+                    <m:t>x</m:t>
+                  </m:r>
+                </m:e>
+              </m:d>
+              <m:r>
+                <m:rPr>
+                  <m:sty m:val="p"/>
+                </m:rPr>
+                <m:t>=</m:t>
+              </m:r>
+              <m:rad>
+                <m:radPr>
+                  <m:degHide m:val="on"/>
+                </m:radPr>
+                <m:deg/>
+                <m:e>
+                  <m:r>
+                    <m:t>2</m:t>
+                  </m:r>
+                  <m:r>
+                    <m:t>x</m:t>
+                  </m:r>
+                  <m:r>
+                    <m:rPr>
+                      <m:sty m:val="p"/>
+                    </m:rPr>
+                    <m:t>−</m:t>
+                  </m:r>
+                  <m:r>
+                    <m:t>4</m:t>
+                  </m:r>
+                </m:e>
+              </m:rad>
+            </m:oMath>
+            <w:r>
+              <w:rPr>
+                <w:rtl/>
+              </w:rPr>
+              <w:t xml:space="preserve"> </w:t>
+            </w:r>
+            <w:r>
+              <w:rPr>
+                <w:rtl/>
+              </w:rPr>
+              <w:t xml:space="preserve">على</w:t>
+            </w:r>
+            <w:r>
+              <w:rPr>
+                <w:rtl/>
+              </w:rPr>
+              <w:t xml:space="preserve"> </w:t>
+            </w:r>
+            <m:oMath>
+              <m:r>
+                <m:rPr>
+                  <m:sty m:val="p"/>
+                </m:rPr>
+                <m:t>[</m:t>
+              </m:r>
+              <m:r>
+                <m:t>2</m:t>
+              </m:r>
+              <m:r>
+                <m:rPr>
+                  <m:sty m:val="p"/>
+                </m:rPr>
+                <m:t>;</m:t>
+              </m:r>
+              <m:r>
+                <m:rPr>
+                  <m:sty m:val="p"/>
+                </m:rPr>
+                <m:t>+</m:t>
+              </m:r>
+              <m:r>
+                <m:rPr>
+                  <m:sty m:val="p"/>
+                </m:rPr>
+                <m:t>∞</m:t>
+              </m:r>
+              <m:r>
+                <m:rPr>
+                  <m:sty m:val="p"/>
+                </m:rPr>
+                <m:t>[</m:t>
+              </m:r>
+            </m:oMath>
+            <w:r>
+              <w:rPr>
+                <w:rtl/>
+              </w:rPr>
+              <w:t xml:space="preserve">:</w:t>
+            </w:r>
+            <w:r>
+              <w:rPr>
+                <w:rtl/>
+              </w:rPr>
+              <w:t xml:space="preserve"> </w:t>
+            </w:r>
+            <m:oMath>
+              <m:r>
+                <m:t>u</m:t>
+              </m:r>
+              <m:d>
+                <m:dPr>
+                  <m:begChr m:val="("/>
+                  <m:endChr m:val=")"/>
+                  <m:sepChr m:val=""/>
+                  <m:grow/>
+                </m:dPr>
+                <m:e>
+                  <m:r>
+                    <m:t>x</m:t>
+                  </m:r>
+                </m:e>
+              </m:d>
+              <m:r>
+                <m:rPr>
+                  <m:sty m:val="p"/>
+                </m:rPr>
+                <m:t>=</m:t>
+              </m:r>
+              <m:r>
+                <m:t>2</m:t>
+              </m:r>
+              <m:r>
+                <m:t>x</m:t>
+              </m:r>
+              <m:r>
+                <m:rPr>
+                  <m:sty m:val="p"/>
+                </m:rPr>
+                <m:t>−</m:t>
+              </m:r>
+              <m:r>
+                <m:t>4</m:t>
+              </m:r>
+              <m:r>
+                <m:rPr>
+                  <m:sty m:val="p"/>
+                </m:rPr>
+                <m:t>≥</m:t>
+              </m:r>
+              <m:r>
+                <m:t>0</m:t>
+              </m:r>
+            </m:oMath>
+            <w:r>
+              <w:rPr>
+                <w:rtl/>
+              </w:rPr>
+              <w:t xml:space="preserve"> </w:t>
+            </w:r>
+            <w:r>
+              <w:rPr>
+                <w:rtl/>
+              </w:rPr>
+              <w:t xml:space="preserve">ومتزايدة تماماً، إذن</w:t>
+            </w:r>
+            <w:r>
+              <w:rPr>
+                <w:rtl/>
+              </w:rPr>
+              <w:t xml:space="preserve"> </w:t>
+            </w:r>
+            <m:oMath>
+              <m:r>
+                <m:t>h</m:t>
+              </m:r>
+              <m:r>
+                <m:rPr>
+                  <m:sty m:val="p"/>
+                </m:rPr>
+                <m:t>=</m:t>
+              </m:r>
+              <m:rad>
+                <m:radPr>
+                  <m:degHide m:val="on"/>
+                </m:radPr>
+                <m:deg/>
+                <m:e>
+                  <m:r>
+                    <m:t>u</m:t>
+                  </m:r>
+                </m:e>
+              </m:rad>
+            </m:oMath>
+            <w:r>
+              <w:rPr>
+                <w:rtl/>
+              </w:rPr>
+              <w:t xml:space="preserve"> </w:t>
+            </w:r>
+            <w:r>
+              <w:rPr>
+                <w:b/>
+                <w:bCs/>
+                <w:rtl/>
+              </w:rPr>
+              <w:t xml:space="preserve">متزايدة تماماً</w:t>
+            </w:r>
+            <w:r>
+              <w:rPr>
+                <w:rtl/>
+              </w:rPr>
+              <w:t xml:space="preserve"> </w:t>
+            </w:r>
+            <w:r>
+              <w:rPr>
+                <w:rtl/>
+              </w:rPr>
+              <w:t xml:space="preserve">على</w:t>
+            </w:r>
+            <w:r>
+              <w:rPr>
+                <w:rtl/>
+              </w:rPr>
+              <w:t xml:space="preserve"> </w:t>
+            </w:r>
+            <m:oMath>
+              <m:r>
+                <m:rPr>
+                  <m:sty m:val="p"/>
+                </m:rPr>
+                <m:t>[</m:t>
+              </m:r>
+              <m:r>
+                <m:t>2</m:t>
+              </m:r>
+              <m:r>
+                <m:rPr>
+                  <m:sty m:val="p"/>
+                </m:rPr>
+                <m:t>;</m:t>
+              </m:r>
+              <m:r>
+                <m:rPr>
+                  <m:sty m:val="p"/>
+                </m:rPr>
+                <m:t>+</m:t>
+              </m:r>
+              <m:r>
+                <m:rPr>
+                  <m:sty m:val="p"/>
+                </m:rPr>
+                <m:t>∞</m:t>
+              </m:r>
+              <m:r>
+                <m:rPr>
+                  <m:sty m:val="p"/>
+                </m:rPr>
+                <m:t>[</m:t>
+              </m:r>
+            </m:oMath>
+            <w:r>
+              <w:rPr>
+                <w:rtl/>
+              </w:rPr>
+              <w:t xml:space="preserve">.</w:t>
+            </w:r>
+          </w:p>
+          <w:p>
+            <w:pPr>
+              <w:numPr>
+                <w:ilvl w:val="0"/>
+                <w:numId w:val="1006"/>
+              </w:numPr>
+              <w:bidi/>
+            </w:pPr>
+            <m:oMath>
+              <m:r>
+                <m:t>k</m:t>
+              </m:r>
+              <m:d>
+                <m:dPr>
+                  <m:begChr m:val="("/>
+                  <m:endChr m:val=")"/>
+                  <m:sepChr m:val=""/>
+                  <m:grow/>
+                </m:dPr>
+                <m:e>
+                  <m:r>
+                    <m:t>x</m:t>
+                  </m:r>
+                </m:e>
+              </m:d>
+              <m:r>
+                <m:rPr>
+                  <m:sty m:val="p"/>
+                </m:rPr>
+                <m:t>=</m:t>
+              </m:r>
+              <m:f>
+                <m:fPr>
+                  <m:type m:val="bar"/>
+                </m:fPr>
+                <m:num>
+                  <m:r>
+                    <m:t>1</m:t>
+                  </m:r>
+                </m:num>
+                <m:den>
+                  <m:sSup>
+                    <m:e>
+                      <m:r>
+                        <m:t>x</m:t>
+                      </m:r>
+                    </m:e>
+                    <m:sup>
+                      <m:r>
+                        <m:t>2</m:t>
+                      </m:r>
+                    </m:sup>
+                  </m:sSup>
+                  <m:r>
+                    <m:rPr>
+                      <m:sty m:val="p"/>
+                    </m:rPr>
+                    <m:t>+</m:t>
+                  </m:r>
+                  <m:r>
+                    <m:t>1</m:t>
+                  </m:r>
+                </m:den>
+              </m:f>
+            </m:oMath>
+            <w:r>
+              <w:rPr>
+                <w:rtl/>
+              </w:rPr>
+              <w:t xml:space="preserve"> </w:t>
+            </w:r>
+            <w:r>
+              <w:rPr>
+                <w:rtl/>
+              </w:rPr>
+              <w:t xml:space="preserve">على</w:t>
+            </w:r>
+            <w:r>
+              <w:rPr>
+                <w:rtl/>
+              </w:rPr>
+              <w:t xml:space="preserve"> </w:t>
+            </w:r>
+            <m:oMath>
+              <m:r>
+                <m:rPr>
+                  <m:sty m:val="p"/>
+                  <m:scr m:val="double-struck"/>
+                </m:rPr>
+                <m:t>R</m:t>
+              </m:r>
+            </m:oMath>
+            <w:r>
+              <w:rPr>
+                <w:rtl/>
+              </w:rPr>
+              <w:t xml:space="preserve">:</w:t>
+            </w:r>
+            <w:r>
+              <w:rPr>
+                <w:rtl/>
+              </w:rPr>
+              <w:t xml:space="preserve"> </w:t>
+            </w:r>
+            <m:oMath>
+              <m:r>
+                <m:t>u</m:t>
+              </m:r>
+              <m:d>
+                <m:dPr>
+                  <m:begChr m:val="("/>
+                  <m:endChr m:val=")"/>
+                  <m:sepChr m:val=""/>
+                  <m:grow/>
+                </m:dPr>
+                <m:e>
+                  <m:r>
+                    <m:t>x</m:t>
+                  </m:r>
+                </m:e>
+              </m:d>
+              <m:r>
+                <m:rPr>
+                  <m:sty m:val="p"/>
+                </m:rPr>
+                <m:t>=</m:t>
+              </m:r>
+              <m:sSup>
+                <m:e>
+                  <m:r>
+                    <m:t>x</m:t>
+                  </m:r>
+                </m:e>
+                <m:sup>
+                  <m:r>
+                    <m:t>2</m:t>
+                  </m:r>
+                </m:sup>
+              </m:sSup>
+              <m:r>
+                <m:rPr>
+                  <m:sty m:val="p"/>
+                </m:rPr>
+                <m:t>+</m:t>
+              </m:r>
+              <m:r>
+                <m:t>1</m:t>
+              </m:r>
+              <m:r>
+                <m:rPr>
+                  <m:sty m:val="p"/>
+                </m:rPr>
+                <m:t>&gt;</m:t>
+              </m:r>
+              <m:r>
+                <m:t>0</m:t>
+              </m:r>
+            </m:oMath>
+            <w:r>
+              <w:rPr>
+                <w:rtl/>
+              </w:rPr>
+              <w:t xml:space="preserve"> </w:t>
+            </w:r>
+            <w:r>
+              <w:rPr>
+                <w:rtl/>
+              </w:rPr>
+              <w:t xml:space="preserve">(إشارة ثابتة ولا تنعدم) ، متناقصة تماماً على</w:t>
+            </w:r>
+            <w:r>
+              <w:rPr>
+                <w:rtl/>
+              </w:rPr>
+              <w:t xml:space="preserve"> </w:t>
+            </w:r>
+            <m:oMath>
+              <m:r>
+                <m:rPr>
+                  <m:sty m:val="p"/>
+                </m:rPr>
+                <m:t>]</m:t>
+              </m:r>
+              <m:r>
+                <m:rPr>
+                  <m:sty m:val="p"/>
+                </m:rPr>
+                <m:t>−</m:t>
+              </m:r>
+              <m:r>
+                <m:rPr>
+                  <m:sty m:val="p"/>
+                </m:rPr>
+                <m:t>∞</m:t>
+              </m:r>
+              <m:r>
+                <m:rPr>
+                  <m:sty m:val="p"/>
+                </m:rPr>
+                <m:t>;</m:t>
+              </m:r>
+              <m:r>
+                <m:t>0</m:t>
+              </m:r>
+              <m:r>
+                <m:rPr>
+                  <m:sty m:val="p"/>
+                </m:rPr>
+                <m:t>]</m:t>
+              </m:r>
+            </m:oMath>
+            <w:r>
+              <w:rPr>
+                <w:rtl/>
+              </w:rPr>
+              <w:t xml:space="preserve"> </w:t>
+            </w:r>
+            <w:r>
+              <w:rPr>
+                <w:rtl/>
+              </w:rPr>
+              <w:t xml:space="preserve">ومتزايدة تماماً على</w:t>
+            </w:r>
+            <w:r>
+              <w:rPr>
+                <w:rtl/>
+              </w:rPr>
+              <w:t xml:space="preserve"> </w:t>
+            </w:r>
+            <m:oMath>
+              <m:r>
+                <m:rPr>
+                  <m:sty m:val="p"/>
+                </m:rPr>
+                <m:t>[</m:t>
+              </m:r>
+              <m:r>
+                <m:t>0</m:t>
+              </m:r>
+              <m:r>
+                <m:rPr>
+                  <m:sty m:val="p"/>
+                </m:rPr>
+                <m:t>;</m:t>
+              </m:r>
+              <m:r>
+                <m:rPr>
+                  <m:sty m:val="p"/>
+                </m:rPr>
+                <m:t>+</m:t>
+              </m:r>
+              <m:r>
+                <m:rPr>
+                  <m:sty m:val="p"/>
+                </m:rPr>
+                <m:t>∞</m:t>
+              </m:r>
+              <m:r>
+                <m:rPr>
+                  <m:sty m:val="p"/>
+                </m:rPr>
+                <m:t>[</m:t>
+              </m:r>
+            </m:oMath>
+            <w:r>
+              <w:rPr>
+                <w:rtl/>
+              </w:rPr>
+              <w:t xml:space="preserve"> </w:t>
+            </w:r>
+            <w:r>
+              <w:rPr>
+                <w:rtl/>
+              </w:rPr>
+              <w:t xml:space="preserve">، إذن</w:t>
+            </w:r>
+            <w:r>
+              <w:rPr>
+                <w:rtl/>
+              </w:rPr>
+              <w:t xml:space="preserve"> </w:t>
+            </w:r>
+            <m:oMath>
+              <m:r>
+                <m:t>k</m:t>
+              </m:r>
+              <m:r>
+                <m:rPr>
+                  <m:sty m:val="p"/>
+                </m:rPr>
+                <m:t>=</m:t>
+              </m:r>
+              <m:f>
+                <m:fPr>
+                  <m:type m:val="bar"/>
+                </m:fPr>
+                <m:num>
+                  <m:r>
+                    <m:t>1</m:t>
+                  </m:r>
+                </m:num>
+                <m:den>
+                  <m:r>
+                    <m:t>u</m:t>
+                  </m:r>
+                </m:den>
+              </m:f>
+            </m:oMath>
+            <w:r>
+              <w:rPr>
+                <w:rtl/>
+              </w:rPr>
+              <w:t xml:space="preserve"> </w:t>
+            </w:r>
+            <w:r>
+              <w:rPr>
+                <w:b/>
+                <w:bCs/>
+                <w:rtl/>
+              </w:rPr>
+              <w:t xml:space="preserve">متزايدة تماماً</w:t>
+            </w:r>
+            <w:r>
+              <w:rPr>
+                <w:rtl/>
+              </w:rPr>
+              <w:t xml:space="preserve"> </w:t>
+            </w:r>
+            <w:r>
+              <w:rPr>
+                <w:rtl/>
+              </w:rPr>
+              <w:t xml:space="preserve">على</w:t>
+            </w:r>
+            <w:r>
+              <w:rPr>
+                <w:rtl/>
+              </w:rPr>
+              <w:t xml:space="preserve"> </w:t>
+            </w:r>
+            <m:oMath>
+              <m:r>
+                <m:rPr>
+                  <m:sty m:val="p"/>
+                </m:rPr>
+                <m:t>]</m:t>
+              </m:r>
+              <m:r>
+                <m:rPr>
+                  <m:sty m:val="p"/>
+                </m:rPr>
+                <m:t>−</m:t>
+              </m:r>
+              <m:r>
+                <m:rPr>
+                  <m:sty m:val="p"/>
+                </m:rPr>
+                <m:t>∞</m:t>
+              </m:r>
+              <m:r>
+                <m:rPr>
+                  <m:sty m:val="p"/>
+                </m:rPr>
+                <m:t>;</m:t>
+              </m:r>
+              <m:r>
+                <m:t>0</m:t>
+              </m:r>
+              <m:r>
+                <m:rPr>
+                  <m:sty m:val="p"/>
+                </m:rPr>
+                <m:t>]</m:t>
+              </m:r>
+            </m:oMath>
+            <w:r>
+              <w:rPr>
+                <w:rtl/>
+              </w:rPr>
+              <w:t xml:space="preserve"> </w:t>
+            </w:r>
+            <w:r>
+              <w:rPr>
+                <w:rtl/>
+              </w:rPr>
+              <w:t xml:space="preserve">و</w:t>
+            </w:r>
+            <w:r>
+              <w:rPr>
+                <w:b/>
+                <w:bCs/>
+                <w:rtl/>
+              </w:rPr>
+              <w:t xml:space="preserve">متناقصة تماماً</w:t>
+            </w:r>
+            <w:r>
+              <w:rPr>
+                <w:rtl/>
+              </w:rPr>
+              <w:t xml:space="preserve"> </w:t>
+            </w:r>
+            <w:r>
+              <w:rPr>
+                <w:rtl/>
+              </w:rPr>
+              <w:t xml:space="preserve">على</w:t>
+            </w:r>
+            <w:r>
+              <w:rPr>
+                <w:rtl/>
+              </w:rPr>
+              <w:t xml:space="preserve"> </w:t>
+            </w:r>
+            <m:oMath>
+              <m:r>
+                <m:rPr>
+                  <m:sty m:val="p"/>
+                </m:rPr>
+                <m:t>[</m:t>
+              </m:r>
+              <m:r>
+                <m:t>0</m:t>
+              </m:r>
+              <m:r>
+                <m:rPr>
+                  <m:sty m:val="p"/>
+                </m:rPr>
+                <m:t>;</m:t>
+              </m:r>
+              <m:r>
+                <m:rPr>
+                  <m:sty m:val="p"/>
+                </m:rPr>
+                <m:t>+</m:t>
+              </m:r>
+              <m:r>
+                <m:rPr>
+                  <m:sty m:val="p"/>
+                </m:rPr>
+                <m:t>∞</m:t>
+              </m:r>
+              <m:r>
+                <m:rPr>
+                  <m:sty m:val="p"/>
+                </m:rPr>
+                <m:t>[</m:t>
+              </m:r>
+            </m:oMath>
+            <w:r>
+              <w:rPr>
+                <w:rtl/>
+              </w:rPr>
+              <w:t xml:space="preserve">.</w:t>
+            </w:r>
+          </w:p>
+        </w:tc>
+      </w:tr>
+    </w:tbl>
+    <w:p>
+      <w:pPr>
+        <w:bidi/>
+        <w:spacing w:before="0" w:after="0"/>
+      </w:pPr>
+    </w:p>
+    <w:tbl>
+      <w:tblPr>
+        <w:tblW w:w="9864" w:type="dxa"/>
+        <w:jc w:val="center"/>
+        <w:tblBorders>
+          <w:top w:val="single" w:sz="10" w:space="0" w:color="256428"/>
+          <w:left w:val="single" w:sz="10" w:space="0" w:color="256428"/>
+          <w:bottom w:val="single" w:sz="10" w:space="0" w:color="256428"/>
+          <w:right w:val="single" w:sz="10" w:space="0" w:color="256428"/>
+          <w:insideH w:val="single" w:sz="10" w:space="0" w:color="256428"/>
+        </w:tblBorders>
+        <w:tblLayout w:type="fixed"/>
+        <w:tblCellMar>
+          <w:top w:w="40" w:type="dxa"/>
+          <w:left w:w="140" w:type="dxa"/>
+          <w:bottom w:w="60" w:type="dxa"/>
+          <w:right w:w="140" w:type="dxa"/>
+        </w:tblCellMar>
+      </w:tblPr>
+      <w:tblGrid>
+        <w:gridCol w:w="9864"/>
+      </w:tblGrid>
+      <w:tr>
+        <w:trPr>
+          <w:cantSplit/>
+        </w:trPr>
+        <w:tc>
+          <w:tcPr>
+            <w:tcW w:w="9864" w:type="dxa"/>
+            <w:shd w:val="clear" w:color="auto" w:fill="256428"/>
+          </w:tcPr>
+          <w:p>
+            <w:pPr>
+              <w:keepNext/>
+              <w:bidi/>
+              <w:spacing w:before="0" w:after="0"/>
+            </w:pPr>
+            <w:r>
+              <w:rPr>
+                <w:b/>
+                <w:bCs/>
+                <w:color w:val="FFFFFF"/>
+                <w:rtl/>
+              </w:rPr>
+              <w:t xml:space="preserve">ملاحظة</w:t>
+            </w:r>
+          </w:p>
+        </w:tc>
+      </w:tr>
+      <w:tr>
+        <w:tc>
+          <w:tcPr>
+            <w:tcW w:w="9864" w:type="dxa"/>
+            <w:shd w:val="clear" w:color="auto" w:fill="F5F8F5"/>
+          </w:tcPr>
+          <w:p>
+            <w:pPr>
+              <w:bidi/>
+            </w:pPr>
+            <w:r>
+              <w:rPr>
+                <w:rtl/>
+              </w:rPr>
+              <w:t xml:space="preserve">شرط الإشارة الثابتة ضروري في قاعدة</w:t>
+            </w:r>
+            <w:r>
+              <w:rPr>
+                <w:rtl/>
+              </w:rPr>
+              <w:t xml:space="preserve"> </w:t>
+            </w:r>
+            <m:oMath>
+              <m:f>
+                <m:fPr>
+                  <m:type m:val="bar"/>
+                </m:fPr>
+                <m:num>
+                  <m:r>
+                    <m:t>1</m:t>
+                  </m:r>
+                </m:num>
+                <m:den>
+                  <m:r>
+                    <m:t>u</m:t>
+                  </m:r>
+                </m:den>
+              </m:f>
+            </m:oMath>
+            <w:r>
+              <w:rPr>
+                <w:rtl/>
+              </w:rPr>
+              <w:t xml:space="preserve">: الدالة</w:t>
+            </w:r>
+            <w:r>
+              <w:rPr>
+                <w:rtl/>
+              </w:rPr>
+              <w:t xml:space="preserve"> </w:t>
+            </w:r>
+            <m:oMath>
+              <m:r>
+                <m:t>u</m:t>
+              </m:r>
+              <m:d>
+                <m:dPr>
+                  <m:begChr m:val="("/>
+                  <m:endChr m:val=")"/>
+                  <m:sepChr m:val=""/>
+                  <m:grow/>
+                </m:dPr>
+                <m:e>
+                  <m:r>
+                    <m:t>x</m:t>
+                  </m:r>
+                </m:e>
+              </m:d>
+              <m:r>
+                <m:rPr>
+                  <m:sty m:val="p"/>
+                </m:rPr>
+                <m:t>=</m:t>
+              </m:r>
+              <m:r>
+                <m:t>x</m:t>
+              </m:r>
+            </m:oMath>
+            <w:r>
+              <w:rPr>
+                <w:rtl/>
+              </w:rPr>
+              <w:t xml:space="preserve"> </w:t>
+            </w:r>
+            <w:r>
+              <w:rPr>
+                <w:rtl/>
+              </w:rPr>
+              <w:t xml:space="preserve">متزايدة على</w:t>
+            </w:r>
+            <w:r>
+              <w:rPr>
+                <w:rtl/>
+              </w:rPr>
+              <w:t xml:space="preserve"> </w:t>
+            </w:r>
+            <m:oMath>
+              <m:sSup>
+                <m:e>
+                  <m:r>
+                    <m:rPr>
+                      <m:sty m:val="p"/>
+                      <m:scr m:val="double-struck"/>
+                    </m:rPr>
+                    <m:t>R</m:t>
+                  </m:r>
+                </m:e>
+                <m:sup>
+                  <m:r>
+                    <m:rPr>
+                      <m:sty m:val="p"/>
+                    </m:rPr>
+                    <m:t>*</m:t>
+                  </m:r>
+                </m:sup>
+              </m:sSup>
+            </m:oMath>
+            <w:r>
+              <w:rPr>
+                <w:rtl/>
+              </w:rPr>
+              <w:t xml:space="preserve"> </w:t>
+            </w:r>
+            <w:r>
+              <w:rPr>
+                <w:rtl/>
+              </w:rPr>
+              <w:t xml:space="preserve">، لكن</w:t>
+            </w:r>
+            <w:r>
+              <w:rPr>
+                <w:rtl/>
+              </w:rPr>
+              <w:t xml:space="preserve"> </w:t>
+            </w:r>
+            <m:oMath>
+              <m:f>
+                <m:fPr>
+                  <m:type m:val="bar"/>
+                </m:fPr>
+                <m:num>
+                  <m:r>
+                    <m:t>1</m:t>
+                  </m:r>
+                </m:num>
+                <m:den>
+                  <m:r>
+                    <m:t>x</m:t>
+                  </m:r>
+                </m:den>
+              </m:f>
+            </m:oMath>
+            <w:r>
+              <w:rPr>
+                <w:rtl/>
+              </w:rPr>
+              <w:t xml:space="preserve"> </w:t>
+            </w:r>
+            <w:r>
+              <w:rPr>
+                <w:rtl/>
+              </w:rPr>
+              <w:t xml:space="preserve">ليست متناقصة على</w:t>
+            </w:r>
+            <w:r>
+              <w:rPr>
+                <w:rtl/>
+              </w:rPr>
+              <w:t xml:space="preserve"> </w:t>
+            </w:r>
+            <m:oMath>
+              <m:sSup>
+                <m:e>
+                  <m:r>
+                    <m:rPr>
+                      <m:sty m:val="p"/>
+                      <m:scr m:val="double-struck"/>
+                    </m:rPr>
+                    <m:t>R</m:t>
+                  </m:r>
+                </m:e>
+                <m:sup>
+                  <m:r>
+                    <m:rPr>
+                      <m:sty m:val="p"/>
+                    </m:rPr>
+                    <m:t>*</m:t>
+                  </m:r>
+                </m:sup>
+              </m:sSup>
+            </m:oMath>
+            <w:r>
+              <w:rPr>
+                <w:rtl/>
+              </w:rPr>
+              <w:t xml:space="preserve"> </w:t>
+            </w:r>
+            <w:r>
+              <w:rPr>
+                <w:rtl/>
+              </w:rPr>
+              <w:t xml:space="preserve">كله (</w:t>
+            </w:r>
+            <m:oMath>
+              <m:r>
+                <m:rPr>
+                  <m:sty m:val="p"/>
+                </m:rPr>
+                <m:t>−</m:t>
+              </m:r>
+              <m:r>
+                <m:t>1</m:t>
+              </m:r>
+              <m:r>
+                <m:rPr>
+                  <m:sty m:val="p"/>
+                </m:rPr>
+                <m:t>&lt;</m:t>
+              </m:r>
+              <m:r>
+                <m:t>1</m:t>
+              </m:r>
+            </m:oMath>
+            <w:r>
+              <w:rPr>
+                <w:rtl/>
+              </w:rPr>
+              <w:t xml:space="preserve"> </w:t>
+            </w:r>
+            <w:r>
+              <w:rPr>
+                <w:rtl/>
+              </w:rPr>
+              <w:t xml:space="preserve">و</w:t>
+            </w:r>
+            <w:r>
+              <w:rPr>
+                <w:rtl/>
+              </w:rPr>
+              <w:t xml:space="preserve"> </w:t>
+            </w:r>
+            <m:oMath>
+              <m:f>
+                <m:fPr>
+                  <m:type m:val="bar"/>
+                </m:fPr>
+                <m:num>
+                  <m:r>
+                    <m:t>1</m:t>
+                  </m:r>
+                </m:num>
+                <m:den>
+                  <m:r>
+                    <m:rPr>
+                      <m:sty m:val="p"/>
+                    </m:rPr>
+                    <m:t>−</m:t>
+                  </m:r>
+                  <m:r>
+                    <m:t>1</m:t>
+                  </m:r>
+                </m:den>
+              </m:f>
+              <m:r>
+                <m:rPr>
+                  <m:sty m:val="p"/>
+                </m:rPr>
+                <m:t>&lt;</m:t>
+              </m:r>
+              <m:f>
+                <m:fPr>
+                  <m:type m:val="bar"/>
+                </m:fPr>
+                <m:num>
+                  <m:r>
+                    <m:t>1</m:t>
+                  </m:r>
+                </m:num>
+                <m:den>
+                  <m:r>
+                    <m:t>1</m:t>
+                  </m:r>
+                </m:den>
+              </m:f>
+            </m:oMath>
+            <w:r>
+              <w:rPr>
+                <w:rtl/>
+              </w:rPr>
+              <w:t xml:space="preserve">) ؛ هي متناقصة على كل من المجالين</w:t>
+            </w:r>
+            <w:r>
+              <w:rPr>
+                <w:rtl/>
+              </w:rPr>
+              <w:t xml:space="preserve"> </w:t>
+            </w:r>
+            <m:oMath>
+              <m:r>
+                <m:rPr>
+                  <m:sty m:val="p"/>
+                </m:rPr>
+                <m:t>]</m:t>
+              </m:r>
+              <m:r>
+                <m:rPr>
+                  <m:sty m:val="p"/>
+                </m:rPr>
+                <m:t>−</m:t>
+              </m:r>
+              <m:r>
+                <m:rPr>
+                  <m:sty m:val="p"/>
+                </m:rPr>
+                <m:t>∞</m:t>
+              </m:r>
+              <m:r>
+                <m:rPr>
+                  <m:sty m:val="p"/>
+                </m:rPr>
+                <m:t>;</m:t>
+              </m:r>
+              <m:r>
+                <m:t>0</m:t>
+              </m:r>
+              <m:r>
+                <m:rPr>
+                  <m:sty m:val="p"/>
+                </m:rPr>
+                <m:t>[</m:t>
+              </m:r>
+            </m:oMath>
+            <w:r>
+              <w:rPr>
+                <w:rtl/>
+              </w:rPr>
+              <w:t xml:space="preserve"> </w:t>
+            </w:r>
+            <w:r>
+              <w:rPr>
+                <w:rtl/>
+              </w:rPr>
+              <w:t xml:space="preserve">و</w:t>
+            </w:r>
+            <w:r>
+              <w:rPr>
+                <w:rtl/>
+              </w:rPr>
+              <w:t xml:space="preserve"> </w:t>
+            </w:r>
+            <m:oMath>
+              <m:r>
+                <m:rPr>
+                  <m:sty m:val="p"/>
+                </m:rPr>
+                <m:t>]</m:t>
+              </m:r>
+              <m:r>
+                <m:t>0</m:t>
+              </m:r>
+              <m:r>
+                <m:rPr>
+                  <m:sty m:val="p"/>
+                </m:rPr>
+                <m:t>;</m:t>
+              </m:r>
+              <m:r>
+                <m:rPr>
+                  <m:sty m:val="p"/>
+                </m:rPr>
+                <m:t>+</m:t>
+              </m:r>
+              <m:r>
+                <m:rPr>
+                  <m:sty m:val="p"/>
+                </m:rPr>
+                <m:t>∞</m:t>
+              </m:r>
+              <m:r>
+                <m:rPr>
+                  <m:sty m:val="p"/>
+                </m:rPr>
+                <m:t>[</m:t>
+              </m:r>
+            </m:oMath>
+            <w:r>
+              <w:rPr>
+                <w:rtl/>
+              </w:rPr>
+              <w:t xml:space="preserve"> </w:t>
+            </w:r>
+            <w:r>
+              <w:rPr>
+                <w:rtl/>
+              </w:rPr>
+              <w:t xml:space="preserve">على حدة.</w:t>
             </w:r>
           </w:p>
         </w:tc>
@@ -14498,7 +16157,7 @@
                           <a:graphicData uri="http://schemas.openxmlformats.org/drawingml/2006/picture">
                             <pic:pic>
                               <pic:nvPicPr>
-                                <pic:cNvPr id="0" name="865c8d288eb6ef0e.png"/>
+                                <pic:cNvPr id="0" name="7c1bab78c8eaa036.png"/>
                                 <pic:cNvPicPr/>
                               </pic:nvPicPr>
                               <pic:blipFill>

</xml_diff>